<commit_message>
Add word template for technical report
</commit_message>
<xml_diff>
--- a/word/font_compare_in_practice.docx
+++ b/word/font_compare_in_practice.docx
@@ -1,6 +1,6 @@
 
 <file path=word/document.xml><?xml version="1.0" encoding="utf-8"?>
-<w:document xmlns:wpc="http://schemas.microsoft.com/office/word/2010/wordprocessingCanvas" xmlns:cx="http://schemas.microsoft.com/office/drawing/2014/chartex" xmlns:cx1="http://schemas.microsoft.com/office/drawing/2015/9/8/chartex" xmlns:mc="http://schemas.openxmlformats.org/markup-compatibility/2006" xmlns:o="urn:schemas-microsoft-com:office:office" xmlns:r="http://schemas.openxmlformats.org/officeDocument/2006/relationships" xmlns:m="http://schemas.openxmlformats.org/officeDocument/2006/math" xmlns:v="urn:schemas-microsoft-com:vml" xmlns:wp14="http://schemas.microsoft.com/office/word/2010/wordprocessingDrawing" xmlns:wp="http://schemas.openxmlformats.org/drawingml/2006/wordprocessingDrawing" xmlns:w10="urn:schemas-microsoft-com:office:word" xmlns:w="http://schemas.openxmlformats.org/wordprocessingml/2006/main" xmlns:w14="http://schemas.microsoft.com/office/word/2010/wordml" xmlns:w15="http://schemas.microsoft.com/office/word/2012/wordml" xmlns:w16se="http://schemas.microsoft.com/office/word/2015/wordml/symex" xmlns:wpg="http://schemas.microsoft.com/office/word/2010/wordprocessingGroup" xmlns:wpi="http://schemas.microsoft.com/office/word/2010/wordprocessingInk" xmlns:wne="http://schemas.microsoft.com/office/word/2006/wordml" xmlns:wps="http://schemas.microsoft.com/office/word/2010/wordprocessingShape" mc:Ignorable="w14 w15 w16se wp14">
+<w:document xmlns:wpc="http://schemas.microsoft.com/office/word/2010/wordprocessingCanvas" xmlns:cx="http://schemas.microsoft.com/office/drawing/2014/chartex" xmlns:cx1="http://schemas.microsoft.com/office/drawing/2015/9/8/chartex" xmlns:cx2="http://schemas.microsoft.com/office/drawing/2015/10/21/chartex" xmlns:cx3="http://schemas.microsoft.com/office/drawing/2016/5/9/chartex" xmlns:cx4="http://schemas.microsoft.com/office/drawing/2016/5/10/chartex" xmlns:cx5="http://schemas.microsoft.com/office/drawing/2016/5/11/chartex" xmlns:cx6="http://schemas.microsoft.com/office/drawing/2016/5/12/chartex" xmlns:cx7="http://schemas.microsoft.com/office/drawing/2016/5/13/chartex" xmlns:cx8="http://schemas.microsoft.com/office/drawing/2016/5/14/chartex" xmlns:mc="http://schemas.openxmlformats.org/markup-compatibility/2006" xmlns:aink="http://schemas.microsoft.com/office/drawing/2016/ink" xmlns:am3d="http://schemas.microsoft.com/office/drawing/2017/model3d" xmlns:o="urn:schemas-microsoft-com:office:office" xmlns:oel="http://schemas.microsoft.com/office/2019/extlst" xmlns:r="http://schemas.openxmlformats.org/officeDocument/2006/relationships" xmlns:m="http://schemas.openxmlformats.org/officeDocument/2006/math" xmlns:v="urn:schemas-microsoft-com:vml" xmlns:wp14="http://schemas.microsoft.com/office/word/2010/wordprocessingDrawing" xmlns:wp="http://schemas.openxmlformats.org/drawingml/2006/wordprocessingDrawing" xmlns:w10="urn:schemas-microsoft-com:office:word" xmlns:w="http://schemas.openxmlformats.org/wordprocessingml/2006/main" xmlns:w14="http://schemas.microsoft.com/office/word/2010/wordml" xmlns:w15="http://schemas.microsoft.com/office/word/2012/wordml" xmlns:w16cex="http://schemas.microsoft.com/office/word/2018/wordml/cex" xmlns:w16cid="http://schemas.microsoft.com/office/word/2016/wordml/cid" xmlns:w16="http://schemas.microsoft.com/office/word/2018/wordml" xmlns:w16du="http://schemas.microsoft.com/office/word/2023/wordml/word16du" xmlns:w16sdtdh="http://schemas.microsoft.com/office/word/2020/wordml/sdtdatahash" xmlns:w16se="http://schemas.microsoft.com/office/word/2015/wordml/symex" xmlns:wpg="http://schemas.microsoft.com/office/word/2010/wordprocessingGroup" xmlns:wpi="http://schemas.microsoft.com/office/word/2010/wordprocessingInk" xmlns:wne="http://schemas.microsoft.com/office/word/2006/wordml" xmlns:wps="http://schemas.microsoft.com/office/word/2010/wordprocessingShape" mc:Ignorable="w14 w15 w16se w16cid w16 w16cex w16sdtdh w16du wp14">
   <w:body>
     <w:p>
       <w:pPr>
@@ -25,43 +25,33 @@
       </w:r>
       <w:r>
         <w:rPr>
-          <w:rFonts w:cs="Nazanin"/>
-          <w:sz w:val="48"/>
-          <w:szCs w:val="48"/>
-          <w:rtl/>
-          <w:lang w:bidi="fa-IR"/>
-        </w:rPr>
-        <w:softHyphen/>
-      </w:r>
-      <w:r>
-        <w:rPr>
           <w:rFonts w:cs="Nazanin" w:hint="cs"/>
           <w:sz w:val="48"/>
           <w:szCs w:val="48"/>
           <w:rtl/>
           <w:lang w:bidi="fa-IR"/>
         </w:rPr>
+        <w:t>‌</w:t>
+      </w:r>
+      <w:r>
+        <w:rPr>
+          <w:rFonts w:cs="Nazanin" w:hint="cs"/>
+          <w:sz w:val="48"/>
+          <w:szCs w:val="48"/>
+          <w:rtl/>
+          <w:lang w:bidi="fa-IR"/>
+        </w:rPr>
         <w:t>ی انسان</w:t>
       </w:r>
       <w:r>
         <w:rPr>
-          <w:rFonts w:cs="Nazanin"/>
-          <w:sz w:val="48"/>
-          <w:szCs w:val="48"/>
-          <w:rtl/>
-          <w:lang w:bidi="fa-IR"/>
-        </w:rPr>
-        <w:softHyphen/>
-      </w:r>
-      <w:r>
-        <w:rPr>
           <w:rFonts w:cs="Nazanin" w:hint="cs"/>
           <w:sz w:val="48"/>
           <w:szCs w:val="48"/>
           <w:rtl/>
           <w:lang w:bidi="fa-IR"/>
         </w:rPr>
-        <w:t xml:space="preserve">های </w:t>
+        <w:t>‌</w:t>
       </w:r>
       <w:r>
         <w:rPr>
@@ -71,17 +61,7 @@
           <w:rtl/>
           <w:lang w:bidi="fa-IR"/>
         </w:rPr>
-        <w:t xml:space="preserve">0913 </w:t>
-      </w:r>
-      <w:r>
-        <w:rPr>
-          <w:rFonts w:cs="Nazanin" w:hint="cs"/>
-          <w:sz w:val="48"/>
-          <w:szCs w:val="48"/>
-          <w:rtl/>
-          <w:lang w:bidi="fa-IR"/>
-        </w:rPr>
-        <w:t xml:space="preserve">باهوش دنیا </w:t>
+        <w:t xml:space="preserve">های 0913 باهوش دنیا </w:t>
       </w:r>
       <w:r>
         <w:rPr>
@@ -125,22 +105,22 @@
       </w:r>
       <w:r>
         <w:rPr>
-          <w:rFonts w:cs="B Nazanin"/>
-          <w:sz w:val="48"/>
-          <w:szCs w:val="48"/>
-          <w:rtl/>
-          <w:lang w:bidi="fa-IR"/>
-        </w:rPr>
-        <w:softHyphen/>
-      </w:r>
-      <w:r>
-        <w:rPr>
           <w:rFonts w:cs="B Nazanin" w:hint="cs"/>
           <w:sz w:val="48"/>
           <w:szCs w:val="48"/>
           <w:rtl/>
           <w:lang w:bidi="fa-IR"/>
         </w:rPr>
+        <w:t>‌</w:t>
+      </w:r>
+      <w:r>
+        <w:rPr>
+          <w:rFonts w:cs="B Nazanin" w:hint="cs"/>
+          <w:sz w:val="48"/>
+          <w:szCs w:val="48"/>
+          <w:rtl/>
+          <w:lang w:bidi="fa-IR"/>
+        </w:rPr>
         <w:t>ی</w:t>
       </w:r>
       <w:r>
@@ -155,13 +135,13 @@
       </w:r>
       <w:r>
         <w:rPr>
-          <w:rFonts w:cs="B Nazanin"/>
-          <w:sz w:val="48"/>
-          <w:szCs w:val="48"/>
-          <w:rtl/>
-          <w:lang w:bidi="fa-IR"/>
-        </w:rPr>
-        <w:softHyphen/>
+          <w:rFonts w:cs="B Nazanin" w:hint="cs"/>
+          <w:sz w:val="48"/>
+          <w:szCs w:val="48"/>
+          <w:rtl/>
+          <w:lang w:bidi="fa-IR"/>
+        </w:rPr>
+        <w:t>‌</w:t>
       </w:r>
       <w:r>
         <w:rPr>
@@ -235,23 +215,40 @@
       </w:r>
       <w:r>
         <w:rPr>
+          <w:rFonts w:ascii="IRNazanin" w:hAnsi="IRNazanin" w:cs="IRNazanin" w:hint="cs"/>
+          <w:sz w:val="48"/>
+          <w:szCs w:val="48"/>
+          <w:rtl/>
+          <w:lang w:bidi="fa-IR"/>
+        </w:rPr>
+        <w:t>‌</w:t>
+      </w:r>
+      <w:r>
+        <w:rPr>
+          <w:rFonts w:ascii="IRNazanin" w:hAnsi="IRNazanin" w:cs="IRNazanin" w:hint="cs"/>
+          <w:sz w:val="48"/>
+          <w:szCs w:val="48"/>
+          <w:rtl/>
+          <w:lang w:bidi="fa-IR"/>
+        </w:rPr>
+        <w:t>ی</w:t>
+      </w:r>
+      <w:r>
+        <w:rPr>
           <w:rFonts w:ascii="IRNazanin" w:hAnsi="IRNazanin" w:cs="IRNazanin"/>
           <w:sz w:val="48"/>
           <w:szCs w:val="48"/>
           <w:rtl/>
           <w:lang w:bidi="fa-IR"/>
         </w:rPr>
-        <w:softHyphen/>
-      </w:r>
-      <w:r>
-        <w:rPr>
-          <w:rFonts w:ascii="IRNazanin" w:hAnsi="IRNazanin" w:cs="IRNazanin" w:hint="cs"/>
-          <w:sz w:val="48"/>
-          <w:szCs w:val="48"/>
-          <w:rtl/>
-          <w:lang w:bidi="fa-IR"/>
-        </w:rPr>
-        <w:t>ی</w:t>
+        <w:t xml:space="preserve"> انسان</w:t>
+      </w:r>
+      <w:r>
+        <w:rPr>
+          <w:rFonts w:hint="cs"/>
+          <w:rtl/>
+        </w:rPr>
+        <w:t>‌</w:t>
       </w:r>
       <w:r>
         <w:rPr>
@@ -261,17 +258,6 @@
           <w:rtl/>
           <w:lang w:bidi="fa-IR"/>
         </w:rPr>
-        <w:t xml:space="preserve"> انسان</w:t>
-      </w:r>
-      <w:r>
-        <w:rPr>
-          <w:rFonts w:ascii="IRNazanin" w:hAnsi="IRNazanin" w:cs="IRNazanin"/>
-          <w:sz w:val="48"/>
-          <w:szCs w:val="48"/>
-          <w:rtl/>
-          <w:lang w:bidi="fa-IR"/>
-        </w:rPr>
-        <w:softHyphen/>
         <w:t>های</w:t>
       </w:r>
       <w:r>
@@ -336,13 +322,33 @@
       </w:r>
       <w:r>
         <w:rPr>
+          <w:rFonts w:ascii="XB Niloofar" w:hAnsi="XB Niloofar" w:cs="XB Niloofar" w:hint="cs"/>
+          <w:sz w:val="48"/>
+          <w:szCs w:val="48"/>
+          <w:rtl/>
+          <w:lang w:bidi="fa-IR"/>
+        </w:rPr>
+        <w:t>‌</w:t>
+      </w:r>
+      <w:r>
+        <w:rPr>
           <w:rFonts w:ascii="XB Niloofar" w:hAnsi="XB Niloofar" w:cs="XB Niloofar"/>
           <w:sz w:val="48"/>
           <w:szCs w:val="48"/>
           <w:rtl/>
           <w:lang w:bidi="fa-IR"/>
         </w:rPr>
-        <w:softHyphen/>
+        <w:t>ی</w:t>
+      </w:r>
+      <w:r>
+        <w:rPr>
+          <w:rFonts w:ascii="XB Niloofar" w:hAnsi="XB Niloofar" w:cs="XB Niloofar" w:hint="cs"/>
+          <w:sz w:val="48"/>
+          <w:szCs w:val="48"/>
+          <w:rtl/>
+          <w:lang w:bidi="fa-IR"/>
+        </w:rPr>
+        <w:t xml:space="preserve"> </w:t>
       </w:r>
       <w:r>
         <w:rPr>
@@ -352,7 +358,7 @@
           <w:rtl/>
           <w:lang w:bidi="fa-IR"/>
         </w:rPr>
-        <w:t>ی</w:t>
+        <w:t>انسان</w:t>
       </w:r>
       <w:r>
         <w:rPr>
@@ -362,7 +368,7 @@
           <w:rtl/>
           <w:lang w:bidi="fa-IR"/>
         </w:rPr>
-        <w:t xml:space="preserve"> </w:t>
+        <w:t>‌</w:t>
       </w:r>
       <w:r>
         <w:rPr>
@@ -372,17 +378,6 @@
           <w:rtl/>
           <w:lang w:bidi="fa-IR"/>
         </w:rPr>
-        <w:t>انسان</w:t>
-      </w:r>
-      <w:r>
-        <w:rPr>
-          <w:rFonts w:ascii="XB Niloofar" w:hAnsi="XB Niloofar" w:cs="XB Niloofar"/>
-          <w:sz w:val="48"/>
-          <w:szCs w:val="48"/>
-          <w:rtl/>
-          <w:lang w:bidi="fa-IR"/>
-        </w:rPr>
-        <w:softHyphen/>
         <w:t xml:space="preserve">های </w:t>
       </w:r>
       <w:r>
@@ -419,15 +414,13 @@
       <w:pPr>
         <w:bidi/>
         <w:rPr>
-          <w:rFonts w:cs="B Nazanin" w:hint="cs"/>
+          <w:rFonts w:cs="B Nazanin"/>
           <w:sz w:val="52"/>
           <w:szCs w:val="52"/>
           <w:rtl/>
           <w:lang w:bidi="fa-IR"/>
         </w:rPr>
       </w:pPr>
-      <w:bookmarkStart w:id="0" w:name="_GoBack"/>
-      <w:bookmarkEnd w:id="0"/>
     </w:p>
     <w:sectPr>
       <w:pgSz w:w="12240" w:h="15840"/>
@@ -440,7 +433,7 @@
 </file>
 
 <file path=word/styles.xml><?xml version="1.0" encoding="utf-8"?>
-<w:styles xmlns:mc="http://schemas.openxmlformats.org/markup-compatibility/2006" xmlns:r="http://schemas.openxmlformats.org/officeDocument/2006/relationships" xmlns:w="http://schemas.openxmlformats.org/wordprocessingml/2006/main" xmlns:w14="http://schemas.microsoft.com/office/word/2010/wordml" xmlns:w15="http://schemas.microsoft.com/office/word/2012/wordml" xmlns:w16se="http://schemas.microsoft.com/office/word/2015/wordml/symex" mc:Ignorable="w14 w15 w16se">
+<w:styles xmlns:mc="http://schemas.openxmlformats.org/markup-compatibility/2006" xmlns:r="http://schemas.openxmlformats.org/officeDocument/2006/relationships" xmlns:w="http://schemas.openxmlformats.org/wordprocessingml/2006/main" xmlns:w14="http://schemas.microsoft.com/office/word/2010/wordml" xmlns:w15="http://schemas.microsoft.com/office/word/2012/wordml" xmlns:w16cex="http://schemas.microsoft.com/office/word/2018/wordml/cex" xmlns:w16cid="http://schemas.microsoft.com/office/word/2016/wordml/cid" xmlns:w16="http://schemas.microsoft.com/office/word/2018/wordml" xmlns:w16du="http://schemas.microsoft.com/office/word/2023/wordml/word16du" xmlns:w16sdtdh="http://schemas.microsoft.com/office/word/2020/wordml/sdtdatahash" xmlns:w16se="http://schemas.microsoft.com/office/word/2015/wordml/symex" mc:Ignorable="w14 w15 w16se w16cid w16 w16cex w16sdtdh w16du">
   <w:docDefaults>
     <w:rPrDefault>
       <w:rPr>
@@ -456,7 +449,7 @@
       </w:pPr>
     </w:pPrDefault>
   </w:docDefaults>
-  <w:latentStyles w:defLockedState="0" w:defUIPriority="99" w:defSemiHidden="0" w:defUnhideWhenUsed="0" w:defQFormat="0" w:count="371">
+  <w:latentStyles w:defLockedState="0" w:defUIPriority="99" w:defSemiHidden="0" w:defUnhideWhenUsed="0" w:defQFormat="0" w:count="376">
     <w:lsdException w:name="Normal" w:uiPriority="0" w:qFormat="1"/>
     <w:lsdException w:name="heading 1" w:uiPriority="9" w:qFormat="1"/>
     <w:lsdException w:name="heading 2" w:semiHidden="1" w:uiPriority="9" w:unhideWhenUsed="1" w:qFormat="1"/>
@@ -828,6 +821,11 @@
     <w:lsdException w:name="List Table 5 Dark Accent 6" w:uiPriority="50"/>
     <w:lsdException w:name="List Table 6 Colorful Accent 6" w:uiPriority="51"/>
     <w:lsdException w:name="List Table 7 Colorful Accent 6" w:uiPriority="52"/>
+    <w:lsdException w:name="Mention" w:semiHidden="1" w:unhideWhenUsed="1"/>
+    <w:lsdException w:name="Smart Hyperlink" w:semiHidden="1" w:unhideWhenUsed="1"/>
+    <w:lsdException w:name="Hashtag" w:semiHidden="1" w:unhideWhenUsed="1"/>
+    <w:lsdException w:name="Unresolved Mention" w:semiHidden="1" w:unhideWhenUsed="1"/>
+    <w:lsdException w:name="Smart Link" w:semiHidden="1" w:unhideWhenUsed="1"/>
   </w:latentStyles>
   <w:style w:type="paragraph" w:default="1" w:styleId="Normal">
     <w:name w:val="Normal"/>
@@ -836,7 +834,6 @@
   <w:style w:type="character" w:default="1" w:styleId="DefaultParagraphFont">
     <w:name w:val="Default Paragraph Font"/>
     <w:uiPriority w:val="1"/>
-    <w:semiHidden/>
     <w:unhideWhenUsed/>
   </w:style>
   <w:style w:type="table" w:default="1" w:styleId="TableNormal">

</xml_diff>